<commit_message>
OV05 v3: re-roll the wound-dressing commission to a subtler form after v2 (Dakin's/wet-to-dry/povidone) ceilinged 0.72-0.92 (every model caught the flagrant cytotoxic order). v3 order = silver alginate + absorbent foam on a clean low-exudate granulating bed (plausible exudate mismatch + unneeded antimicrobial); golden + grader updated. v2 ceiling evidence saved. Gates green; golden satisfies Section A. Awaiting re-pilot; retire to A5 if it ceilings again
</commit_message>
<xml_diff>
--- a/worlds/ondina-vasquell/tasks/task5/current/golden-OV05.docx
+++ b/worlds/ondina-vasquell/tasks/task5/current/golden-OV05.docx
@@ -674,7 +674,7 @@
           <w:color w:val="232830"/>
           <w:sz w:val="19"/>
         </w:rPr>
-        <w:t>The overnight wound-care order for Dakin's solution wet-to-dry changes with povidone-iodine is not appropriate for this wound and is corrected. The base is clean red granulation with scant serous exudate and no active local infection. Cytotoxic antiseptics, sodium hypochlorite and povidone-iodine, and wet-to-dry gauze damage granulation tissue and delay healing on a clean granulating bed. They are discontinued.</w:t>
+        <w:t>The overnight order for a silver alginate dressing with an absorbent foam cover is not the right match for this wound and is corrected. The base is clean red granulation with scant serous exudate and no active local infection. Alginate and absorbent foam are for moderate-to-heavy exudate; on a low-exudate granulating bed they dry the wound out and adhere, traumatizing the granulation tissue on removal. Silver is an antimicrobial that is not needed on a clean, non-infected wound and may slow epithelialization. The order is discontinued.</w:t>
       </w:r>
     </w:p>
     <w:p>
@@ -690,7 +690,7 @@
           <w:color w:val="232830"/>
           <w:sz w:val="19"/>
         </w:rPr>
-        <w:t>Dressing: a daily non-adherent moist wound dressing that keeps the bed moist and atraumatic, for example a non-adherent contact layer or saline-moistened non-adherent gauze for the low serous exudate. Skilled nursing-level dressing changes per the wound-care consult.</w:t>
+        <w:t>Dressing: a simple daily non-adherent moist dressing matched to the low serous exudate, for example a non-adherent contact layer or saline-moistened non-adherent gauze that keeps the bed moist and atraumatic. Skilled nursing-level dressing changes per the wound-care consult.</w:t>
       </w:r>
     </w:p>
     <w:p>

</xml_diff>